<commit_message>
feat: customize certificate based on the affiliate's gender
</commit_message>
<xml_diff>
--- a/resources/templates/certificado_convenio_template.docx
+++ b/resources/templates/certificado_convenio_template.docx
@@ -16,7 +16,6 @@
     </w:p>
     <w:p>
       <w:pPr>
-        <w:ind w:firstLine="708"/>
         <w:rPr>
           <w:rFonts w:asciiTheme="minorHAnsi" w:hAnsiTheme="minorHAnsi" w:cstheme="minorHAnsi"/>
           <w:i/>
@@ -30,13 +29,13 @@
           <w:noProof/>
           <w:lang w:val="es-419" w:eastAsia="es-419"/>
         </w:rPr>
-        <w:pict w14:anchorId="00A14C58">
+        <w:pict w14:anchorId="19A46702">
           <v:shapetype id="_x0000_t201" coordsize="21600,21600" o:spt="201" path="m,l,21600r21600,l21600,xe">
             <v:stroke joinstyle="miter"/>
             <v:path shadowok="f" o:extrusionok="f" strokeok="f" fillok="f" o:connecttype="rect"/>
             <o:lock v:ext="edit" shapetype="t"/>
           </v:shapetype>
-          <v:shape id="_x0000_s2050" type="#_x0000_t201" alt="" style="position:absolute;left:0;text-align:left;margin-left:537.85pt;margin-top:34.8pt;width:83.25pt;height:36.75pt;z-index:251660288;mso-wrap-edited:f;mso-width-percent:0;mso-height-percent:0;mso-width-percent:0;mso-height-percent:0" o:preferrelative="t" filled="f" stroked="f">
+          <v:shape id="_x0000_s2050" type="#_x0000_t201" alt="" style="position:absolute;margin-left:537.85pt;margin-top:34.8pt;width:83.25pt;height:36.75pt;z-index:251660288;mso-wrap-edited:f;mso-width-percent:0;mso-height-percent:0;mso-width-percent:0;mso-height-percent:0" o:preferrelative="t" filled="f" stroked="f">
             <v:imagedata r:id="rId8" o:title=""/>
             <o:lock v:ext="edit" aspectratio="t"/>
           </v:shape>
@@ -55,6 +54,76 @@
           <w:rFonts w:asciiTheme="minorHAnsi" w:hAnsiTheme="minorHAnsi" w:cstheme="minorHAnsi"/>
         </w:rPr>
         <w:t>${FECHA_CERTIFICADO}</w:t>
+      </w:r>
+    </w:p>
+    <w:p>
+      <w:pPr>
+        <w:spacing w:after="0" w:line="240" w:lineRule="auto"/>
+        <w:jc w:val="both"/>
+        <w:rPr>
+          <w:rFonts w:asciiTheme="minorHAnsi" w:hAnsiTheme="minorHAnsi"/>
+          <w:i/>
+          <w:iCs/>
+        </w:rPr>
+      </w:pPr>
+      <w:bookmarkStart w:id="0" w:name="_Hlk113457402"/>
+      <w:r>
+        <w:rPr>
+          <w:rFonts w:asciiTheme="minorHAnsi" w:hAnsiTheme="minorHAnsi"/>
+          <w:b/>
+          <w:bCs/>
+          <w:i/>
+          <w:iCs/>
+        </w:rPr>
+        <w:t>${DESTINATARIO_COMPLETO}</w:t>
+      </w:r>
+      <w:r>
+        <w:rPr>
+          <w:rFonts w:asciiTheme="minorHAnsi" w:hAnsiTheme="minorHAnsi"/>
+          <w:i/>
+          <w:iCs/>
+        </w:rPr>
+        <w:fldChar w:fldCharType="begin"/>
+      </w:r>
+      <w:r>
+        <w:rPr>
+          <w:rFonts w:asciiTheme="minorHAnsi" w:hAnsiTheme="minorHAnsi"/>
+          <w:i/>
+          <w:iCs/>
+        </w:rPr>
+        <w:instrText xml:space="preserve"> IF </w:instrText>
+      </w:r>
+      <w:r>
+        <w:rPr>
+          <w:rFonts w:asciiTheme="minorHAnsi" w:hAnsiTheme="minorHAnsi"/>
+          <w:i/>
+          <w:iCs/>
+        </w:rPr>
+        <w:fldChar w:fldCharType="begin"/>
+      </w:r>
+      <w:r>
+        <w:rPr>
+          <w:rFonts w:asciiTheme="minorHAnsi" w:hAnsiTheme="minorHAnsi"/>
+          <w:i/>
+          <w:iCs/>
+        </w:rPr>
+        <w:instrText xml:space="preserve"> MERGEFIELD DESTINATARIO </w:instrText>
+      </w:r>
+      <w:r>
+        <w:rPr>
+          <w:rFonts w:asciiTheme="minorHAnsi" w:hAnsiTheme="minorHAnsi"/>
+          <w:i/>
+          <w:iCs/>
+        </w:rPr>
+        <w:fldChar w:fldCharType="end"/>
+      </w:r>
+      <w:r>
+        <w:rPr>
+          <w:rFonts w:asciiTheme="minorHAnsi" w:hAnsiTheme="minorHAnsi"/>
+          <w:i/>
+          <w:iCs/>
+        </w:rPr>
+        <w:instrText xml:space="preserve"> &lt;&gt; "" "Señores</w:instrText>
       </w:r>
     </w:p>
     <w:p>
@@ -64,77 +133,66 @@
         <w:jc w:val="both"/>
         <w:rPr>
           <w:rFonts w:asciiTheme="minorHAnsi" w:hAnsiTheme="minorHAnsi"/>
-          <w:i/>
-          <w:iCs/>
+          <w:b/>
+          <w:bCs/>
+          <w:i/>
+          <w:iCs/>
+          <w:noProof/>
         </w:rPr>
       </w:pPr>
-    </w:p>
-    <w:bookmarkStart w:id="0" w:name="_Hlk113457402"/>
-    <w:p>
-      <w:pPr>
-        <w:spacing w:after="0" w:line="240" w:lineRule="auto"/>
-        <w:ind w:firstLine="708"/>
-        <w:jc w:val="both"/>
+      <w:r>
         <w:rPr>
           <w:rFonts w:asciiTheme="minorHAnsi" w:hAnsiTheme="minorHAnsi"/>
-          <w:i/>
-          <w:iCs/>
-        </w:rPr>
-      </w:pPr>
+          <w:b/>
+          <w:bCs/>
+          <w:i/>
+          <w:iCs/>
+        </w:rPr>
+        <w:fldChar w:fldCharType="begin"/>
+      </w:r>
       <w:r>
         <w:rPr>
           <w:rFonts w:asciiTheme="minorHAnsi" w:hAnsiTheme="minorHAnsi"/>
-          <w:i/>
-          <w:iCs/>
-        </w:rPr>
-        <w:fldChar w:fldCharType="begin"/>
+          <w:b/>
+          <w:bCs/>
+          <w:i/>
+          <w:iCs/>
+        </w:rPr>
+        <w:instrText xml:space="preserve"> MERGEFIELD  DESTINATARIO \* Upper </w:instrText>
       </w:r>
       <w:r>
         <w:rPr>
           <w:rFonts w:asciiTheme="minorHAnsi" w:hAnsiTheme="minorHAnsi"/>
-          <w:i/>
-          <w:iCs/>
-        </w:rPr>
-        <w:instrText xml:space="preserve"> IF </w:instrText>
+          <w:b/>
+          <w:bCs/>
+          <w:i/>
+          <w:iCs/>
+        </w:rPr>
+        <w:fldChar w:fldCharType="separate"/>
       </w:r>
       <w:r>
         <w:rPr>
           <w:rFonts w:asciiTheme="minorHAnsi" w:hAnsiTheme="minorHAnsi"/>
-          <w:i/>
-          <w:iCs/>
-        </w:rPr>
-        <w:fldChar w:fldCharType="begin"/>
-      </w:r>
-      <w:r>
-        <w:rPr>
-          <w:rFonts w:asciiTheme="minorHAnsi" w:hAnsiTheme="minorHAnsi"/>
-          <w:i/>
-          <w:iCs/>
-        </w:rPr>
-        <w:instrText xml:space="preserve"> MERGEFIELD DESTINATARIO </w:instrText>
-      </w:r>
-      <w:r>
-        <w:rPr>
-          <w:rFonts w:asciiTheme="minorHAnsi" w:hAnsiTheme="minorHAnsi"/>
-          <w:i/>
-          <w:iCs/>
-        </w:rPr>
-        <w:fldChar w:fldCharType="end"/>
-      </w:r>
-      <w:r>
-        <w:rPr>
-          <w:rFonts w:asciiTheme="minorHAnsi" w:hAnsiTheme="minorHAnsi"/>
-          <w:i/>
-          <w:iCs/>
-        </w:rPr>
-        <w:instrText xml:space="preserve"> &lt;&gt; "" "Señores</w:instrText>
+          <w:b/>
+          <w:bCs/>
+          <w:i/>
+          <w:iCs/>
+          <w:noProof/>
+        </w:rPr>
+        <w:instrText>COOPERATIVA FINANCIERA</w:instrText>
       </w:r>
     </w:p>
     <w:p>
       <w:pPr>
         <w:spacing w:after="0" w:line="240" w:lineRule="auto"/>
         <w:ind w:firstLine="708"/>
-        <w:jc w:val="both"/>
+        <w:rPr>
+          <w:rFonts w:asciiTheme="minorHAnsi" w:hAnsiTheme="minorHAnsi" w:cstheme="minorHAnsi"/>
+          <w:b/>
+          <w:bCs/>
+        </w:rPr>
+      </w:pPr>
+      <w:r>
         <w:rPr>
           <w:rFonts w:asciiTheme="minorHAnsi" w:hAnsiTheme="minorHAnsi"/>
           <w:b/>
@@ -143,7 +201,8 @@
           <w:iCs/>
           <w:noProof/>
         </w:rPr>
-      </w:pPr>
+        <w:instrText>MEDELLIN</w:instrText>
+      </w:r>
       <w:r>
         <w:rPr>
           <w:rFonts w:asciiTheme="minorHAnsi" w:hAnsiTheme="minorHAnsi"/>
@@ -152,7 +211,7 @@
           <w:i/>
           <w:iCs/>
         </w:rPr>
-        <w:fldChar w:fldCharType="begin"/>
+        <w:fldChar w:fldCharType="end"/>
       </w:r>
       <w:r>
         <w:rPr>
@@ -162,244 +221,57 @@
           <w:i/>
           <w:iCs/>
         </w:rPr>
-        <w:instrText xml:space="preserve"> MERGEFIELD  DESTINATARIO \* Upper </w:instrText>
+        <w:instrText xml:space="preserve"> </w:instrText>
       </w:r>
       <w:r>
         <w:rPr>
           <w:rFonts w:asciiTheme="minorHAnsi" w:hAnsiTheme="minorHAnsi"/>
-          <w:b/>
-          <w:bCs/>
-          <w:i/>
-          <w:iCs/>
-        </w:rPr>
-        <w:fldChar w:fldCharType="separate"/>
+          <w:i/>
+          <w:iCs/>
+        </w:rPr>
+        <w:instrText xml:space="preserve">" "" </w:instrText>
       </w:r>
       <w:r>
         <w:rPr>
           <w:rFonts w:asciiTheme="minorHAnsi" w:hAnsiTheme="minorHAnsi"/>
-          <w:b/>
-          <w:bCs/>
-          <w:i/>
-          <w:iCs/>
-          <w:noProof/>
-        </w:rPr>
-        <w:instrText>COOPERATIVA FINANCIERA</w:instrText>
-      </w:r>
+          <w:i/>
+          <w:iCs/>
+        </w:rPr>
+        <w:fldChar w:fldCharType="end"/>
+      </w:r>
+      <w:bookmarkEnd w:id="0"/>
     </w:p>
     <w:p>
       <w:pPr>
         <w:spacing w:after="0" w:line="240" w:lineRule="auto"/>
-        <w:ind w:firstLine="708"/>
-        <w:jc w:val="both"/>
         <w:rPr>
           <w:rFonts w:asciiTheme="minorHAnsi" w:hAnsiTheme="minorHAnsi"/>
+          <w:b/>
+          <w:bCs/>
           <w:i/>
           <w:iCs/>
         </w:rPr>
       </w:pPr>
       <w:r>
         <w:rPr>
-          <w:rFonts w:asciiTheme="minorHAnsi" w:hAnsiTheme="minorHAnsi"/>
+          <w:rFonts w:asciiTheme="minorHAnsi" w:hAnsiTheme="minorHAnsi" w:cstheme="minorHAnsi"/>
           <w:b/>
           <w:bCs/>
-          <w:i/>
-          <w:iCs/>
-          <w:noProof/>
-        </w:rPr>
-        <w:instrText>MEDELLIN</w:instrText>
-      </w:r>
-      <w:r>
-        <w:rPr>
-          <w:rFonts w:asciiTheme="minorHAnsi" w:hAnsiTheme="minorHAnsi"/>
+        </w:rPr>
+        <w:br/>
+      </w:r>
+      <w:r>
+        <w:rPr>
+          <w:rFonts w:asciiTheme="minorHAnsi" w:hAnsiTheme="minorHAnsi" w:cstheme="minorHAnsi"/>
           <w:b/>
           <w:bCs/>
-          <w:i/>
-          <w:iCs/>
-        </w:rPr>
-        <w:fldChar w:fldCharType="end"/>
-      </w:r>
-      <w:r>
-        <w:rPr>
-          <w:rFonts w:asciiTheme="minorHAnsi" w:hAnsiTheme="minorHAnsi"/>
-          <w:b/>
-          <w:bCs/>
-          <w:i/>
-          <w:iCs/>
-        </w:rPr>
-        <w:instrText xml:space="preserve"> </w:instrText>
-      </w:r>
-      <w:r>
-        <w:rPr>
-          <w:rFonts w:asciiTheme="minorHAnsi" w:hAnsiTheme="minorHAnsi"/>
-          <w:i/>
-          <w:iCs/>
-        </w:rPr>
-        <w:instrText xml:space="preserve">" "" </w:instrText>
-      </w:r>
-      <w:r>
-        <w:rPr>
-          <w:rFonts w:asciiTheme="minorHAnsi" w:hAnsiTheme="minorHAnsi"/>
-          <w:i/>
-          <w:iCs/>
-        </w:rPr>
-        <w:fldChar w:fldCharType="end"/>
-      </w:r>
-      <w:bookmarkEnd w:id="0"/>
-      <w:r>
-        <w:rPr>
-          <w:rFonts w:asciiTheme="minorHAnsi" w:hAnsiTheme="minorHAnsi"/>
-          <w:i/>
-          <w:iCs/>
-        </w:rPr>
-        <w:fldChar w:fldCharType="begin"/>
-      </w:r>
-      <w:r>
-        <w:rPr>
-          <w:rFonts w:asciiTheme="minorHAnsi" w:hAnsiTheme="minorHAnsi"/>
-          <w:i/>
-          <w:iCs/>
-        </w:rPr>
-        <w:instrText xml:space="preserve"> IF </w:instrText>
-      </w:r>
-      <w:r>
-        <w:rPr>
-          <w:rFonts w:asciiTheme="minorHAnsi" w:hAnsiTheme="minorHAnsi"/>
-          <w:i/>
-          <w:iCs/>
-        </w:rPr>
-        <w:fldChar w:fldCharType="begin"/>
-      </w:r>
-      <w:r>
-        <w:rPr>
-          <w:rFonts w:asciiTheme="minorHAnsi" w:hAnsiTheme="minorHAnsi"/>
-          <w:i/>
-          <w:iCs/>
-        </w:rPr>
-        <w:instrText xml:space="preserve"> MERGEFIELD DESTINATARIO </w:instrText>
-      </w:r>
-      <w:r>
-        <w:rPr>
-          <w:rFonts w:asciiTheme="minorHAnsi" w:hAnsiTheme="minorHAnsi"/>
-          <w:i/>
-          <w:iCs/>
-        </w:rPr>
-        <w:fldChar w:fldCharType="end"/>
-      </w:r>
-      <w:r>
-        <w:rPr>
-          <w:rFonts w:asciiTheme="minorHAnsi" w:hAnsiTheme="minorHAnsi"/>
-          <w:i/>
-          <w:iCs/>
-        </w:rPr>
-        <w:instrText xml:space="preserve"> = "" </w:instrText>
-      </w:r>
-      <w:r>
-        <w:rPr>
-          <w:rFonts w:asciiTheme="minorHAnsi" w:hAnsiTheme="minorHAnsi"/>
-          <w:b/>
-          <w:bCs/>
-          <w:i/>
-          <w:iCs/>
-        </w:rPr>
-        <w:instrText xml:space="preserve">"A quien </w:instrText>
-      </w:r>
-      <w:r>
-        <w:rPr>
-          <w:rFonts w:asciiTheme="minorHAnsi" w:hAnsiTheme="minorHAnsi"/>
-          <w:b/>
-          <w:bCs/>
-          <w:i/>
-          <w:iCs/>
-        </w:rPr>
-        <w:instrText>corresponda.</w:instrText>
-      </w:r>
-    </w:p>
-    <w:p>
-      <w:pPr>
-        <w:spacing w:after="0" w:line="240" w:lineRule="auto"/>
-        <w:ind w:firstLine="708"/>
-        <w:jc w:val="both"/>
-        <w:rPr>
-          <w:rFonts w:asciiTheme="minorHAnsi" w:hAnsiTheme="minorHAnsi"/>
-          <w:i/>
-          <w:iCs/>
-          <w:noProof/>
-        </w:rPr>
-      </w:pPr>
-      <w:r>
-        <w:rPr>
-          <w:rFonts w:asciiTheme="minorHAnsi" w:hAnsiTheme="minorHAnsi"/>
-          <w:i/>
-          <w:iCs/>
-        </w:rPr>
-        <w:instrText xml:space="preserve">" "" </w:instrText>
-      </w:r>
-      <w:r>
-        <w:rPr>
-          <w:rFonts w:asciiTheme="minorHAnsi" w:hAnsiTheme="minorHAnsi"/>
-          <w:i/>
-          <w:iCs/>
-        </w:rPr>
-        <w:fldChar w:fldCharType="separate"/>
-      </w:r>
-      <w:r>
-        <w:rPr>
-          <w:rFonts w:asciiTheme="minorHAnsi" w:hAnsiTheme="minorHAnsi"/>
-          <w:b/>
-          <w:bCs/>
-          <w:i/>
-          <w:iCs/>
-          <w:noProof/>
-        </w:rPr>
-        <w:t>A quien corresponda.</w:t>
-      </w:r>
-    </w:p>
-    <w:p>
-      <w:pPr>
-        <w:spacing w:after="0" w:line="240" w:lineRule="auto"/>
-        <w:ind w:firstLine="708"/>
-        <w:rPr>
-          <w:rFonts w:asciiTheme="minorHAnsi" w:hAnsiTheme="minorHAnsi"/>
-          <w:i/>
-          <w:iCs/>
-        </w:rPr>
-      </w:pPr>
-      <w:r>
-        <w:rPr>
-          <w:rFonts w:asciiTheme="minorHAnsi" w:hAnsiTheme="minorHAnsi"/>
-          <w:i/>
-          <w:iCs/>
-        </w:rPr>
-        <w:fldChar w:fldCharType="end"/>
-      </w:r>
-    </w:p>
-    <w:p>
-      <w:pPr>
-        <w:spacing w:after="0" w:line="240" w:lineRule="auto"/>
-        <w:ind w:firstLine="708"/>
-        <w:rPr>
-          <w:rFonts w:asciiTheme="minorHAnsi" w:hAnsiTheme="minorHAnsi"/>
-          <w:i/>
-          <w:iCs/>
-        </w:rPr>
-      </w:pPr>
-    </w:p>
-    <w:p>
-      <w:pPr>
-        <w:spacing w:after="0" w:line="240" w:lineRule="auto"/>
-        <w:ind w:firstLine="708"/>
-        <w:jc w:val="both"/>
-        <w:rPr>
-          <w:rFonts w:asciiTheme="minorHAnsi" w:hAnsiTheme="minorHAnsi"/>
-          <w:i/>
-          <w:iCs/>
-        </w:rPr>
-      </w:pPr>
+        </w:rPr>
+        <w:br/>
+      </w:r>
     </w:p>
     <w:p>
       <w:pPr>
         <w:spacing w:afterLines="120" w:after="288" w:line="240" w:lineRule="auto"/>
-        <w:ind w:left="1416" w:hanging="708"/>
         <w:jc w:val="center"/>
         <w:rPr>
           <w:rFonts w:asciiTheme="minorHAnsi" w:hAnsiTheme="minorHAnsi"/>
@@ -441,7 +313,6 @@
     <w:p>
       <w:pPr>
         <w:spacing w:afterLines="120" w:after="288" w:line="240" w:lineRule="auto"/>
-        <w:ind w:left="709" w:hanging="1"/>
         <w:jc w:val="both"/>
         <w:rPr>
           <w:rFonts w:asciiTheme="minorHAnsi" w:hAnsiTheme="minorHAnsi" w:cstheme="minorHAnsi"/>
@@ -530,7 +401,114 @@
           <w:i/>
           <w:iCs/>
         </w:rPr>
-        <w:t xml:space="preserve">certifica que </w:t>
+        <w:t>certifica que</w:t>
+      </w:r>
+      <w:r>
+        <w:rPr>
+          <w:rFonts w:asciiTheme="minorHAnsi" w:hAnsiTheme="minorHAnsi" w:cstheme="minorHAnsi"/>
+          <w:i/>
+          <w:iCs/>
+        </w:rPr>
+        <w:t xml:space="preserve"> </w:t>
+      </w:r>
+      <w:r>
+        <w:rPr>
+          <w:rFonts w:asciiTheme="minorHAnsi" w:hAnsiTheme="minorHAnsi" w:cstheme="minorHAnsi"/>
+          <w:i/>
+          <w:iCs/>
+        </w:rPr>
+        <w:t>${TITULO_PERSONA}</w:t>
+      </w:r>
+      <w:r>
+        <w:rPr>
+          <w:rFonts w:asciiTheme="minorHAnsi" w:hAnsiTheme="minorHAnsi" w:cstheme="minorHAnsi"/>
+          <w:i/>
+          <w:iCs/>
+        </w:rPr>
+        <w:t xml:space="preserve"> </w:t>
+      </w:r>
+      <w:r>
+        <w:rPr>
+          <w:rFonts w:asciiTheme="minorHAnsi" w:hAnsiTheme="minorHAnsi" w:cstheme="minorHAnsi"/>
+        </w:rPr>
+        <w:t>${NOMBRE_COMPLETO}</w:t>
+      </w:r>
+      <w:r>
+        <w:rPr>
+          <w:rFonts w:asciiTheme="minorHAnsi" w:hAnsiTheme="minorHAnsi" w:cstheme="minorHAnsi"/>
+          <w:bCs/>
+          <w:i/>
+          <w:iCs/>
+        </w:rPr>
+        <w:t>,</w:t>
+      </w:r>
+      <w:r>
+        <w:rPr>
+          <w:rFonts w:asciiTheme="minorHAnsi" w:hAnsiTheme="minorHAnsi" w:cstheme="minorHAnsi"/>
+          <w:b/>
+          <w:i/>
+          <w:iCs/>
+        </w:rPr>
+        <w:t xml:space="preserve"> </w:t>
+      </w:r>
+      <w:r>
+        <w:rPr>
+          <w:rFonts w:asciiTheme="minorHAnsi" w:hAnsiTheme="minorHAnsi" w:cstheme="minorHAnsi"/>
+          <w:bCs/>
+          <w:i/>
+          <w:iCs/>
+        </w:rPr>
+        <w:t>${</w:t>
+      </w:r>
+      <w:r>
+        <w:t>IDENTIFICADO_IDENTIFICADA</w:t>
+      </w:r>
+      <w:r>
+        <w:rPr>
+          <w:rFonts w:asciiTheme="minorHAnsi" w:hAnsiTheme="minorHAnsi" w:cstheme="minorHAnsi"/>
+          <w:bCs/>
+          <w:i/>
+          <w:iCs/>
+        </w:rPr>
+        <w:t>}</w:t>
+      </w:r>
+      <w:r>
+        <w:rPr>
+          <w:rFonts w:asciiTheme="minorHAnsi" w:hAnsiTheme="minorHAnsi" w:cstheme="minorHAnsi"/>
+          <w:i/>
+          <w:iCs/>
+        </w:rPr>
+        <w:t xml:space="preserve"> </w:t>
+      </w:r>
+      <w:r>
+        <w:rPr>
+          <w:rFonts w:asciiTheme="minorHAnsi" w:hAnsiTheme="minorHAnsi" w:cstheme="minorHAnsi"/>
+          <w:i/>
+          <w:iCs/>
+        </w:rPr>
+        <w:t xml:space="preserve">con </w:t>
+      </w:r>
+      <w:r>
+        <w:rPr>
+          <w:rFonts w:asciiTheme="minorHAnsi" w:hAnsiTheme="minorHAnsi" w:cstheme="minorHAnsi"/>
+          <w:i/>
+          <w:iCs/>
+        </w:rPr>
+        <w:t xml:space="preserve">documento de identidad </w:t>
+      </w:r>
+      <w:r>
+        <w:rPr>
+          <w:rFonts w:asciiTheme="minorHAnsi" w:hAnsiTheme="minorHAnsi" w:cstheme="minorHAnsi"/>
+        </w:rPr>
+        <w:t>${DOCUMENTO}</w:t>
+      </w:r>
+      <w:r>
+        <w:rPr>
+          <w:rFonts w:asciiTheme="minorHAnsi" w:hAnsiTheme="minorHAnsi" w:cstheme="minorHAnsi"/>
+          <w:i/>
+          <w:iCs/>
+        </w:rPr>
+        <w:t xml:space="preserve">, </w:t>
       </w:r>
       <w:r>
         <w:rPr>
@@ -562,6 +540,204 @@
           <w:i/>
           <w:iCs/>
         </w:rPr>
+        <w:instrText xml:space="preserve"> MERGEFIELD ESTADO </w:instrText>
+      </w:r>
+      <w:r>
+        <w:rPr>
+          <w:rFonts w:asciiTheme="minorHAnsi" w:hAnsiTheme="minorHAnsi" w:cstheme="minorHAnsi"/>
+          <w:i/>
+          <w:iCs/>
+        </w:rPr>
+        <w:fldChar w:fldCharType="separate"/>
+      </w:r>
+      <w:r>
+        <w:rPr>
+          <w:rFonts w:asciiTheme="minorHAnsi" w:hAnsiTheme="minorHAnsi" w:cstheme="minorHAnsi"/>
+          <w:i/>
+          <w:iCs/>
+          <w:noProof/>
+        </w:rPr>
+        <w:instrText>ACTIVO</w:instrText>
+      </w:r>
+      <w:r>
+        <w:rPr>
+          <w:rFonts w:asciiTheme="minorHAnsi" w:hAnsiTheme="minorHAnsi" w:cstheme="minorHAnsi"/>
+          <w:i/>
+          <w:iCs/>
+        </w:rPr>
+        <w:fldChar w:fldCharType="end"/>
+      </w:r>
+      <w:r>
+        <w:rPr>
+          <w:rFonts w:asciiTheme="minorHAnsi" w:hAnsiTheme="minorHAnsi" w:cstheme="minorHAnsi"/>
+          <w:i/>
+          <w:iCs/>
+        </w:rPr>
+        <w:instrText xml:space="preserve"> = "ACTIVO" "se encuentra" "" </w:instrText>
+      </w:r>
+      <w:r>
+        <w:rPr>
+          <w:rFonts w:asciiTheme="minorHAnsi" w:hAnsiTheme="minorHAnsi" w:cstheme="minorHAnsi"/>
+          <w:i/>
+          <w:iCs/>
+        </w:rPr>
+        <w:fldChar w:fldCharType="separate"/>
+      </w:r>
+      <w:r>
+        <w:rPr>
+          <w:rFonts w:asciiTheme="minorHAnsi" w:hAnsiTheme="minorHAnsi" w:cstheme="minorHAnsi"/>
+          <w:i/>
+          <w:iCs/>
+          <w:noProof/>
+        </w:rPr>
+        <w:t>se encuentra</w:t>
+      </w:r>
+      <w:r>
+        <w:rPr>
+          <w:rFonts w:asciiTheme="minorHAnsi" w:hAnsiTheme="minorHAnsi" w:cstheme="minorHAnsi"/>
+          <w:i/>
+          <w:iCs/>
+        </w:rPr>
+        <w:fldChar w:fldCharType="end"/>
+      </w:r>
+      <w:r>
+        <w:rPr>
+          <w:rFonts w:asciiTheme="minorHAnsi" w:hAnsiTheme="minorHAnsi" w:cstheme="minorHAnsi"/>
+          <w:i/>
+          <w:iCs/>
+        </w:rPr>
+        <w:fldChar w:fldCharType="begin"/>
+      </w:r>
+      <w:r>
+        <w:rPr>
+          <w:rFonts w:asciiTheme="minorHAnsi" w:hAnsiTheme="minorHAnsi" w:cstheme="minorHAnsi"/>
+          <w:i/>
+          <w:iCs/>
+        </w:rPr>
+        <w:instrText xml:space="preserve"> IF </w:instrText>
+      </w:r>
+      <w:r>
+        <w:rPr>
+          <w:rFonts w:asciiTheme="minorHAnsi" w:hAnsiTheme="minorHAnsi" w:cstheme="minorHAnsi"/>
+          <w:i/>
+          <w:iCs/>
+        </w:rPr>
+        <w:fldChar w:fldCharType="begin"/>
+      </w:r>
+      <w:r>
+        <w:rPr>
+          <w:rFonts w:asciiTheme="minorHAnsi" w:hAnsiTheme="minorHAnsi" w:cstheme="minorHAnsi"/>
+          <w:i/>
+          <w:iCs/>
+        </w:rPr>
+        <w:instrText xml:space="preserve"> MERGEFIELD ESTADO </w:instrText>
+      </w:r>
+      <w:r>
+        <w:rPr>
+          <w:rFonts w:asciiTheme="minorHAnsi" w:hAnsiTheme="minorHAnsi" w:cstheme="minorHAnsi"/>
+          <w:i/>
+          <w:iCs/>
+        </w:rPr>
+        <w:fldChar w:fldCharType="separate"/>
+      </w:r>
+      <w:r>
+        <w:rPr>
+          <w:rFonts w:asciiTheme="minorHAnsi" w:hAnsiTheme="minorHAnsi" w:cstheme="minorHAnsi"/>
+          <w:i/>
+          <w:iCs/>
+          <w:noProof/>
+        </w:rPr>
+        <w:instrText>ACTIVO</w:instrText>
+      </w:r>
+      <w:r>
+        <w:rPr>
+          <w:rFonts w:asciiTheme="minorHAnsi" w:hAnsiTheme="minorHAnsi" w:cstheme="minorHAnsi"/>
+          <w:i/>
+          <w:iCs/>
+        </w:rPr>
+        <w:fldChar w:fldCharType="end"/>
+      </w:r>
+      <w:r>
+        <w:rPr>
+          <w:rFonts w:asciiTheme="minorHAnsi" w:hAnsiTheme="minorHAnsi" w:cstheme="minorHAnsi"/>
+          <w:i/>
+          <w:iCs/>
+        </w:rPr>
+        <w:instrText xml:space="preserve"> = "NO ACTIVO" "estuvo" "" </w:instrText>
+      </w:r>
+      <w:r>
+        <w:rPr>
+          <w:rFonts w:asciiTheme="minorHAnsi" w:hAnsiTheme="minorHAnsi" w:cstheme="minorHAnsi"/>
+          <w:i/>
+          <w:iCs/>
+        </w:rPr>
+        <w:fldChar w:fldCharType="end"/>
+      </w:r>
+      <w:r>
+        <w:rPr>
+          <w:rFonts w:asciiTheme="minorHAnsi" w:hAnsiTheme="minorHAnsi" w:cstheme="minorHAnsi"/>
+          <w:i/>
+          <w:iCs/>
+        </w:rPr>
+        <w:t xml:space="preserve"> </w:t>
+      </w:r>
+      <w:r>
+        <w:rPr>
+          <w:rFonts w:asciiTheme="minorHAnsi" w:hAnsiTheme="minorHAnsi" w:cstheme="minorHAnsi"/>
+          <w:i/>
+          <w:iCs/>
+        </w:rPr>
+        <w:t>${</w:t>
+      </w:r>
+      <w:r>
+        <w:t>AFILIADO_AFILIADA</w:t>
+      </w:r>
+      <w:r>
+        <w:rPr>
+          <w:rFonts w:asciiTheme="minorHAnsi" w:hAnsiTheme="minorHAnsi" w:cstheme="minorHAnsi"/>
+          <w:i/>
+          <w:iCs/>
+        </w:rPr>
+        <w:t xml:space="preserve">} </w:t>
+      </w:r>
+      <w:r>
+        <w:rPr>
+          <w:rFonts w:asciiTheme="minorHAnsi" w:hAnsiTheme="minorHAnsi" w:cstheme="minorHAnsi"/>
+          <w:i/>
+          <w:iCs/>
+        </w:rPr>
+        <w:t xml:space="preserve"> </w:t>
+      </w:r>
+      <w:r>
+        <w:rPr>
+          <w:rFonts w:asciiTheme="minorHAnsi" w:hAnsiTheme="minorHAnsi" w:cstheme="minorHAnsi"/>
+          <w:i/>
+          <w:iCs/>
+        </w:rPr>
+        <w:fldChar w:fldCharType="begin"/>
+      </w:r>
+      <w:r>
+        <w:rPr>
+          <w:rFonts w:asciiTheme="minorHAnsi" w:hAnsiTheme="minorHAnsi" w:cstheme="minorHAnsi"/>
+          <w:i/>
+          <w:iCs/>
+        </w:rPr>
+        <w:instrText xml:space="preserve"> IF </w:instrText>
+      </w:r>
+      <w:r>
+        <w:rPr>
+          <w:rFonts w:asciiTheme="minorHAnsi" w:hAnsiTheme="minorHAnsi" w:cstheme="minorHAnsi"/>
+          <w:i/>
+          <w:iCs/>
+        </w:rPr>
+        <w:fldChar w:fldCharType="begin"/>
+      </w:r>
+      <w:r>
+        <w:rPr>
+          <w:rFonts w:asciiTheme="minorHAnsi" w:hAnsiTheme="minorHAnsi" w:cstheme="minorHAnsi"/>
+          <w:i/>
+          <w:iCs/>
+        </w:rPr>
         <w:instrText xml:space="preserve"> MERGEFIELD SEXO </w:instrText>
       </w:r>
       <w:r>
@@ -595,31 +771,23 @@
           <w:i/>
           <w:iCs/>
         </w:rPr>
-        <w:instrText xml:space="preserve"> = "F" "</w:instrText>
-      </w:r>
-      <w:r>
-        <w:rPr>
-          <w:rFonts w:asciiTheme="minorHAnsi" w:hAnsiTheme="minorHAnsi" w:cstheme="minorHAnsi"/>
-          <w:i/>
-          <w:iCs/>
-        </w:rPr>
-        <w:instrText>la se</w:instrText>
-      </w:r>
-      <w:r>
-        <w:rPr>
-          <w:rFonts w:asciiTheme="minorHAnsi" w:hAnsiTheme="minorHAnsi" w:cstheme="minorHAnsi"/>
-          <w:i/>
-          <w:iCs/>
-        </w:rPr>
-        <w:instrText xml:space="preserve">ñora" "" </w:instrText>
-      </w:r>
-      <w:r>
-        <w:rPr>
-          <w:rFonts w:asciiTheme="minorHAnsi" w:hAnsiTheme="minorHAnsi" w:cstheme="minorHAnsi"/>
-          <w:i/>
-          <w:iCs/>
-        </w:rPr>
-        <w:fldChar w:fldCharType="end"/>
+        <w:instrText xml:space="preserve"> = "F" "afiliada" "" </w:instrText>
+      </w:r>
+      <w:r>
+        <w:rPr>
+          <w:rFonts w:asciiTheme="minorHAnsi" w:hAnsiTheme="minorHAnsi" w:cstheme="minorHAnsi"/>
+          <w:i/>
+          <w:iCs/>
+        </w:rPr>
+        <w:fldChar w:fldCharType="end"/>
+      </w:r>
+      <w:r>
+        <w:rPr>
+          <w:rFonts w:asciiTheme="minorHAnsi" w:hAnsiTheme="minorHAnsi" w:cstheme="minorHAnsi"/>
+          <w:i/>
+          <w:iCs/>
+        </w:rPr>
+        <w:t>al Sindicato</w:t>
       </w:r>
       <w:r>
         <w:rPr>
@@ -651,7 +819,7 @@
           <w:i/>
           <w:iCs/>
         </w:rPr>
-        <w:instrText xml:space="preserve"> MERGEFIELD SEXO </w:instrText>
+        <w:instrText xml:space="preserve"> MERGEFIELD INGRESO </w:instrText>
       </w:r>
       <w:r>
         <w:rPr>
@@ -668,39 +836,23 @@
           <w:iCs/>
           <w:noProof/>
         </w:rPr>
-        <w:instrText>M</w:instrText>
-      </w:r>
-      <w:r>
-        <w:rPr>
-          <w:rFonts w:asciiTheme="minorHAnsi" w:hAnsiTheme="minorHAnsi" w:cstheme="minorHAnsi"/>
-          <w:i/>
-          <w:iCs/>
-        </w:rPr>
-        <w:fldChar w:fldCharType="end"/>
-      </w:r>
-      <w:r>
-        <w:rPr>
-          <w:rFonts w:asciiTheme="minorHAnsi" w:hAnsiTheme="minorHAnsi" w:cstheme="minorHAnsi"/>
-          <w:i/>
-          <w:iCs/>
-        </w:rPr>
-        <w:instrText xml:space="preserve"> = "M" "</w:instrText>
-      </w:r>
-      <w:r>
-        <w:rPr>
-          <w:rFonts w:asciiTheme="minorHAnsi" w:hAnsiTheme="minorHAnsi" w:cstheme="minorHAnsi"/>
-          <w:i/>
-          <w:iCs/>
-        </w:rPr>
-        <w:instrText>el s</w:instrText>
-      </w:r>
-      <w:r>
-        <w:rPr>
-          <w:rFonts w:asciiTheme="minorHAnsi" w:hAnsiTheme="minorHAnsi" w:cstheme="minorHAnsi"/>
-          <w:i/>
-          <w:iCs/>
-        </w:rPr>
-        <w:instrText xml:space="preserve">eñor" "" </w:instrText>
+        <w:instrText>abril 19/2024</w:instrText>
+      </w:r>
+      <w:r>
+        <w:rPr>
+          <w:rFonts w:asciiTheme="minorHAnsi" w:hAnsiTheme="minorHAnsi" w:cstheme="minorHAnsi"/>
+          <w:i/>
+          <w:iCs/>
+        </w:rPr>
+        <w:fldChar w:fldCharType="end"/>
+      </w:r>
+      <w:r>
+        <w:rPr>
+          <w:rFonts w:asciiTheme="minorHAnsi" w:hAnsiTheme="minorHAnsi" w:cstheme="minorHAnsi"/>
+          <w:i/>
+          <w:iCs/>
+        </w:rPr>
+        <w:instrText xml:space="preserve"> &lt;&gt; "" " desde " ""</w:instrText>
       </w:r>
       <w:r>
         <w:rPr>
@@ -717,680 +869,6 @@
           <w:iCs/>
           <w:noProof/>
         </w:rPr>
-        <w:t>el señor</w:t>
-      </w:r>
-      <w:r>
-        <w:rPr>
-          <w:rFonts w:asciiTheme="minorHAnsi" w:hAnsiTheme="minorHAnsi" w:cstheme="minorHAnsi"/>
-          <w:i/>
-          <w:iCs/>
-        </w:rPr>
-        <w:fldChar w:fldCharType="end"/>
-      </w:r>
-      <w:r>
-        <w:rPr>
-          <w:rFonts w:asciiTheme="minorHAnsi" w:hAnsiTheme="minorHAnsi" w:cstheme="minorHAnsi"/>
-          <w:b/>
-          <w:bCs/>
-          <w:i/>
-          <w:iCs/>
-        </w:rPr>
-        <w:t xml:space="preserve"> </w:t>
-      </w:r>
-      <w:r>
-        <w:rPr>
-          <w:rFonts w:asciiTheme="minorHAnsi" w:hAnsiTheme="minorHAnsi" w:cstheme="minorHAnsi"/>
-        </w:rPr>
-        <w:t>${NOMBRE_COMPLETO}</w:t>
-      </w:r>
-      <w:r>
-        <w:rPr>
-          <w:rFonts w:asciiTheme="minorHAnsi" w:hAnsiTheme="minorHAnsi" w:cstheme="minorHAnsi"/>
-          <w:b/>
-          <w:i/>
-          <w:iCs/>
-        </w:rPr>
-        <w:t>,</w:t>
-      </w:r>
-      <w:r>
-        <w:rPr>
-          <w:rFonts w:asciiTheme="minorHAnsi" w:hAnsiTheme="minorHAnsi" w:cstheme="minorHAnsi"/>
-          <w:i/>
-          <w:iCs/>
-        </w:rPr>
-        <w:t xml:space="preserve"> </w:t>
-      </w:r>
-      <w:r>
-        <w:rPr>
-          <w:rFonts w:asciiTheme="minorHAnsi" w:hAnsiTheme="minorHAnsi" w:cstheme="minorHAnsi"/>
-          <w:i/>
-          <w:iCs/>
-        </w:rPr>
-        <w:fldChar w:fldCharType="begin"/>
-      </w:r>
-      <w:r>
-        <w:rPr>
-          <w:rFonts w:asciiTheme="minorHAnsi" w:hAnsiTheme="minorHAnsi" w:cstheme="minorHAnsi"/>
-          <w:i/>
-          <w:iCs/>
-        </w:rPr>
-        <w:instrText xml:space="preserve"> IF </w:instrText>
-      </w:r>
-      <w:r>
-        <w:rPr>
-          <w:rFonts w:asciiTheme="minorHAnsi" w:hAnsiTheme="minorHAnsi" w:cstheme="minorHAnsi"/>
-          <w:i/>
-          <w:iCs/>
-        </w:rPr>
-        <w:fldChar w:fldCharType="begin"/>
-      </w:r>
-      <w:r>
-        <w:rPr>
-          <w:rFonts w:asciiTheme="minorHAnsi" w:hAnsiTheme="minorHAnsi" w:cstheme="minorHAnsi"/>
-          <w:i/>
-          <w:iCs/>
-        </w:rPr>
-        <w:instrText xml:space="preserve"> MERGEFIELD SEXO </w:instrText>
-      </w:r>
-      <w:r>
-        <w:rPr>
-          <w:rFonts w:asciiTheme="minorHAnsi" w:hAnsiTheme="minorHAnsi" w:cstheme="minorHAnsi"/>
-          <w:i/>
-          <w:iCs/>
-        </w:rPr>
-        <w:fldChar w:fldCharType="separate"/>
-      </w:r>
-      <w:r>
-        <w:rPr>
-          <w:rFonts w:asciiTheme="minorHAnsi" w:hAnsiTheme="minorHAnsi" w:cstheme="minorHAnsi"/>
-          <w:i/>
-          <w:iCs/>
-          <w:noProof/>
-        </w:rPr>
-        <w:instrText>M</w:instrText>
-      </w:r>
-      <w:r>
-        <w:rPr>
-          <w:rFonts w:asciiTheme="minorHAnsi" w:hAnsiTheme="minorHAnsi" w:cstheme="minorHAnsi"/>
-          <w:i/>
-          <w:iCs/>
-        </w:rPr>
-        <w:fldChar w:fldCharType="end"/>
-      </w:r>
-      <w:r>
-        <w:rPr>
-          <w:rFonts w:asciiTheme="minorHAnsi" w:hAnsiTheme="minorHAnsi" w:cstheme="minorHAnsi"/>
-          <w:i/>
-          <w:iCs/>
-        </w:rPr>
-        <w:instrText xml:space="preserve"> = "F" "identificada" "" </w:instrText>
-      </w:r>
-      <w:r>
-        <w:rPr>
-          <w:rFonts w:asciiTheme="minorHAnsi" w:hAnsiTheme="minorHAnsi" w:cstheme="minorHAnsi"/>
-          <w:i/>
-          <w:iCs/>
-        </w:rPr>
-        <w:fldChar w:fldCharType="end"/>
-      </w:r>
-      <w:r>
-        <w:rPr>
-          <w:rFonts w:asciiTheme="minorHAnsi" w:hAnsiTheme="minorHAnsi" w:cstheme="minorHAnsi"/>
-          <w:i/>
-          <w:iCs/>
-        </w:rPr>
-        <w:fldChar w:fldCharType="begin"/>
-      </w:r>
-      <w:r>
-        <w:rPr>
-          <w:rFonts w:asciiTheme="minorHAnsi" w:hAnsiTheme="minorHAnsi" w:cstheme="minorHAnsi"/>
-          <w:i/>
-          <w:iCs/>
-        </w:rPr>
-        <w:instrText xml:space="preserve"> IF </w:instrText>
-      </w:r>
-      <w:r>
-        <w:rPr>
-          <w:rFonts w:asciiTheme="minorHAnsi" w:hAnsiTheme="minorHAnsi" w:cstheme="minorHAnsi"/>
-          <w:i/>
-          <w:iCs/>
-        </w:rPr>
-        <w:fldChar w:fldCharType="begin"/>
-      </w:r>
-      <w:r>
-        <w:rPr>
-          <w:rFonts w:asciiTheme="minorHAnsi" w:hAnsiTheme="minorHAnsi" w:cstheme="minorHAnsi"/>
-          <w:i/>
-          <w:iCs/>
-        </w:rPr>
-        <w:instrText xml:space="preserve"> MERGEFIELD SEXO </w:instrText>
-      </w:r>
-      <w:r>
-        <w:rPr>
-          <w:rFonts w:asciiTheme="minorHAnsi" w:hAnsiTheme="minorHAnsi" w:cstheme="minorHAnsi"/>
-          <w:i/>
-          <w:iCs/>
-        </w:rPr>
-        <w:fldChar w:fldCharType="separate"/>
-      </w:r>
-      <w:r>
-        <w:rPr>
-          <w:rFonts w:asciiTheme="minorHAnsi" w:hAnsiTheme="minorHAnsi" w:cstheme="minorHAnsi"/>
-          <w:i/>
-          <w:iCs/>
-          <w:noProof/>
-        </w:rPr>
-        <w:instrText>M</w:instrText>
-      </w:r>
-      <w:r>
-        <w:rPr>
-          <w:rFonts w:asciiTheme="minorHAnsi" w:hAnsiTheme="minorHAnsi" w:cstheme="minorHAnsi"/>
-          <w:i/>
-          <w:iCs/>
-        </w:rPr>
-        <w:fldChar w:fldCharType="end"/>
-      </w:r>
-      <w:r>
-        <w:rPr>
-          <w:rFonts w:asciiTheme="minorHAnsi" w:hAnsiTheme="minorHAnsi" w:cstheme="minorHAnsi"/>
-          <w:i/>
-          <w:iCs/>
-        </w:rPr>
-        <w:instrText xml:space="preserve"> = "M" "identificado" "" </w:instrText>
-      </w:r>
-      <w:r>
-        <w:rPr>
-          <w:rFonts w:asciiTheme="minorHAnsi" w:hAnsiTheme="minorHAnsi" w:cstheme="minorHAnsi"/>
-          <w:i/>
-          <w:iCs/>
-        </w:rPr>
-        <w:fldChar w:fldCharType="separate"/>
-      </w:r>
-      <w:r>
-        <w:rPr>
-          <w:rFonts w:asciiTheme="minorHAnsi" w:hAnsiTheme="minorHAnsi" w:cstheme="minorHAnsi"/>
-          <w:i/>
-          <w:iCs/>
-          <w:noProof/>
-        </w:rPr>
-        <w:t>identificado</w:t>
-      </w:r>
-      <w:r>
-        <w:rPr>
-          <w:rFonts w:asciiTheme="minorHAnsi" w:hAnsiTheme="minorHAnsi" w:cstheme="minorHAnsi"/>
-          <w:i/>
-          <w:iCs/>
-        </w:rPr>
-        <w:fldChar w:fldCharType="end"/>
-      </w:r>
-      <w:r>
-        <w:rPr>
-          <w:rFonts w:asciiTheme="minorHAnsi" w:hAnsiTheme="minorHAnsi" w:cstheme="minorHAnsi"/>
-          <w:i/>
-          <w:iCs/>
-        </w:rPr>
-        <w:t xml:space="preserve"> </w:t>
-      </w:r>
-      <w:r>
-        <w:rPr>
-          <w:rFonts w:asciiTheme="minorHAnsi" w:hAnsiTheme="minorHAnsi" w:cstheme="minorHAnsi"/>
-          <w:i/>
-          <w:iCs/>
-        </w:rPr>
-        <w:t xml:space="preserve">con </w:t>
-      </w:r>
-      <w:r>
-        <w:rPr>
-          <w:rFonts w:asciiTheme="minorHAnsi" w:hAnsiTheme="minorHAnsi" w:cstheme="minorHAnsi"/>
-          <w:i/>
-          <w:iCs/>
-        </w:rPr>
-        <w:t xml:space="preserve">documento de identidad </w:t>
-      </w:r>
-      <w:r>
-        <w:rPr>
-          <w:rFonts w:asciiTheme="minorHAnsi" w:hAnsiTheme="minorHAnsi" w:cstheme="minorHAnsi"/>
-        </w:rPr>
-        <w:t>${DOCUMENTO}</w:t>
-      </w:r>
-      <w:r>
-        <w:rPr>
-          <w:rFonts w:asciiTheme="minorHAnsi" w:hAnsiTheme="minorHAnsi" w:cstheme="minorHAnsi"/>
-          <w:i/>
-          <w:iCs/>
-        </w:rPr>
-        <w:t xml:space="preserve">, </w:t>
-      </w:r>
-      <w:r>
-        <w:rPr>
-          <w:rFonts w:asciiTheme="minorHAnsi" w:hAnsiTheme="minorHAnsi" w:cstheme="minorHAnsi"/>
-          <w:i/>
-          <w:iCs/>
-        </w:rPr>
-        <w:fldChar w:fldCharType="begin"/>
-      </w:r>
-      <w:r>
-        <w:rPr>
-          <w:rFonts w:asciiTheme="minorHAnsi" w:hAnsiTheme="minorHAnsi" w:cstheme="minorHAnsi"/>
-          <w:i/>
-          <w:iCs/>
-        </w:rPr>
-        <w:instrText xml:space="preserve"> IF </w:instrText>
-      </w:r>
-      <w:r>
-        <w:rPr>
-          <w:rFonts w:asciiTheme="minorHAnsi" w:hAnsiTheme="minorHAnsi" w:cstheme="minorHAnsi"/>
-          <w:i/>
-          <w:iCs/>
-        </w:rPr>
-        <w:fldChar w:fldCharType="begin"/>
-      </w:r>
-      <w:r>
-        <w:rPr>
-          <w:rFonts w:asciiTheme="minorHAnsi" w:hAnsiTheme="minorHAnsi" w:cstheme="minorHAnsi"/>
-          <w:i/>
-          <w:iCs/>
-        </w:rPr>
-        <w:instrText xml:space="preserve"> MERGEFIELD ESTADO </w:instrText>
-      </w:r>
-      <w:r>
-        <w:rPr>
-          <w:rFonts w:asciiTheme="minorHAnsi" w:hAnsiTheme="minorHAnsi" w:cstheme="minorHAnsi"/>
-          <w:i/>
-          <w:iCs/>
-        </w:rPr>
-        <w:fldChar w:fldCharType="separate"/>
-      </w:r>
-      <w:r>
-        <w:rPr>
-          <w:rFonts w:asciiTheme="minorHAnsi" w:hAnsiTheme="minorHAnsi" w:cstheme="minorHAnsi"/>
-          <w:i/>
-          <w:iCs/>
-          <w:noProof/>
-        </w:rPr>
-        <w:instrText>ACTIVO</w:instrText>
-      </w:r>
-      <w:r>
-        <w:rPr>
-          <w:rFonts w:asciiTheme="minorHAnsi" w:hAnsiTheme="minorHAnsi" w:cstheme="minorHAnsi"/>
-          <w:i/>
-          <w:iCs/>
-        </w:rPr>
-        <w:fldChar w:fldCharType="end"/>
-      </w:r>
-      <w:r>
-        <w:rPr>
-          <w:rFonts w:asciiTheme="minorHAnsi" w:hAnsiTheme="minorHAnsi" w:cstheme="minorHAnsi"/>
-          <w:i/>
-          <w:iCs/>
-        </w:rPr>
-        <w:instrText xml:space="preserve"> = "ACTIVO" "se encuentra" "" </w:instrText>
-      </w:r>
-      <w:r>
-        <w:rPr>
-          <w:rFonts w:asciiTheme="minorHAnsi" w:hAnsiTheme="minorHAnsi" w:cstheme="minorHAnsi"/>
-          <w:i/>
-          <w:iCs/>
-        </w:rPr>
-        <w:fldChar w:fldCharType="separate"/>
-      </w:r>
-      <w:r>
-        <w:rPr>
-          <w:rFonts w:asciiTheme="minorHAnsi" w:hAnsiTheme="minorHAnsi" w:cstheme="minorHAnsi"/>
-          <w:i/>
-          <w:iCs/>
-          <w:noProof/>
-        </w:rPr>
-        <w:t>se encuentra</w:t>
-      </w:r>
-      <w:r>
-        <w:rPr>
-          <w:rFonts w:asciiTheme="minorHAnsi" w:hAnsiTheme="minorHAnsi" w:cstheme="minorHAnsi"/>
-          <w:i/>
-          <w:iCs/>
-        </w:rPr>
-        <w:fldChar w:fldCharType="end"/>
-      </w:r>
-      <w:r>
-        <w:rPr>
-          <w:rFonts w:asciiTheme="minorHAnsi" w:hAnsiTheme="minorHAnsi" w:cstheme="minorHAnsi"/>
-          <w:i/>
-          <w:iCs/>
-        </w:rPr>
-        <w:fldChar w:fldCharType="begin"/>
-      </w:r>
-      <w:r>
-        <w:rPr>
-          <w:rFonts w:asciiTheme="minorHAnsi" w:hAnsiTheme="minorHAnsi" w:cstheme="minorHAnsi"/>
-          <w:i/>
-          <w:iCs/>
-        </w:rPr>
-        <w:instrText xml:space="preserve"> IF </w:instrText>
-      </w:r>
-      <w:r>
-        <w:rPr>
-          <w:rFonts w:asciiTheme="minorHAnsi" w:hAnsiTheme="minorHAnsi" w:cstheme="minorHAnsi"/>
-          <w:i/>
-          <w:iCs/>
-        </w:rPr>
-        <w:fldChar w:fldCharType="begin"/>
-      </w:r>
-      <w:r>
-        <w:rPr>
-          <w:rFonts w:asciiTheme="minorHAnsi" w:hAnsiTheme="minorHAnsi" w:cstheme="minorHAnsi"/>
-          <w:i/>
-          <w:iCs/>
-        </w:rPr>
-        <w:instrText xml:space="preserve"> MERGEFIELD ESTADO </w:instrText>
-      </w:r>
-      <w:r>
-        <w:rPr>
-          <w:rFonts w:asciiTheme="minorHAnsi" w:hAnsiTheme="minorHAnsi" w:cstheme="minorHAnsi"/>
-          <w:i/>
-          <w:iCs/>
-        </w:rPr>
-        <w:fldChar w:fldCharType="separate"/>
-      </w:r>
-      <w:r>
-        <w:rPr>
-          <w:rFonts w:asciiTheme="minorHAnsi" w:hAnsiTheme="minorHAnsi" w:cstheme="minorHAnsi"/>
-          <w:i/>
-          <w:iCs/>
-          <w:noProof/>
-        </w:rPr>
-        <w:instrText>ACTIVO</w:instrText>
-      </w:r>
-      <w:r>
-        <w:rPr>
-          <w:rFonts w:asciiTheme="minorHAnsi" w:hAnsiTheme="minorHAnsi" w:cstheme="minorHAnsi"/>
-          <w:i/>
-          <w:iCs/>
-        </w:rPr>
-        <w:fldChar w:fldCharType="end"/>
-      </w:r>
-      <w:r>
-        <w:rPr>
-          <w:rFonts w:asciiTheme="minorHAnsi" w:hAnsiTheme="minorHAnsi" w:cstheme="minorHAnsi"/>
-          <w:i/>
-          <w:iCs/>
-        </w:rPr>
-        <w:instrText xml:space="preserve"> = "NO ACTIVO" "estuvo" "" </w:instrText>
-      </w:r>
-      <w:r>
-        <w:rPr>
-          <w:rFonts w:asciiTheme="minorHAnsi" w:hAnsiTheme="minorHAnsi" w:cstheme="minorHAnsi"/>
-          <w:i/>
-          <w:iCs/>
-        </w:rPr>
-        <w:fldChar w:fldCharType="end"/>
-      </w:r>
-      <w:r>
-        <w:rPr>
-          <w:rFonts w:asciiTheme="minorHAnsi" w:hAnsiTheme="minorHAnsi" w:cstheme="minorHAnsi"/>
-          <w:i/>
-          <w:iCs/>
-        </w:rPr>
-        <w:t xml:space="preserve"> </w:t>
-      </w:r>
-      <w:r>
-        <w:rPr>
-          <w:rFonts w:asciiTheme="minorHAnsi" w:hAnsiTheme="minorHAnsi" w:cstheme="minorHAnsi"/>
-          <w:i/>
-          <w:iCs/>
-        </w:rPr>
-        <w:fldChar w:fldCharType="begin"/>
-      </w:r>
-      <w:r>
-        <w:rPr>
-          <w:rFonts w:asciiTheme="minorHAnsi" w:hAnsiTheme="minorHAnsi" w:cstheme="minorHAnsi"/>
-          <w:i/>
-          <w:iCs/>
-        </w:rPr>
-        <w:instrText xml:space="preserve"> IF </w:instrText>
-      </w:r>
-      <w:r>
-        <w:rPr>
-          <w:rFonts w:asciiTheme="minorHAnsi" w:hAnsiTheme="minorHAnsi" w:cstheme="minorHAnsi"/>
-          <w:i/>
-          <w:iCs/>
-        </w:rPr>
-        <w:fldChar w:fldCharType="begin"/>
-      </w:r>
-      <w:r>
-        <w:rPr>
-          <w:rFonts w:asciiTheme="minorHAnsi" w:hAnsiTheme="minorHAnsi" w:cstheme="minorHAnsi"/>
-          <w:i/>
-          <w:iCs/>
-        </w:rPr>
-        <w:instrText xml:space="preserve"> MERGEFIELD SEXO </w:instrText>
-      </w:r>
-      <w:r>
-        <w:rPr>
-          <w:rFonts w:asciiTheme="minorHAnsi" w:hAnsiTheme="minorHAnsi" w:cstheme="minorHAnsi"/>
-          <w:i/>
-          <w:iCs/>
-        </w:rPr>
-        <w:fldChar w:fldCharType="separate"/>
-      </w:r>
-      <w:r>
-        <w:rPr>
-          <w:rFonts w:asciiTheme="minorHAnsi" w:hAnsiTheme="minorHAnsi" w:cstheme="minorHAnsi"/>
-          <w:i/>
-          <w:iCs/>
-          <w:noProof/>
-        </w:rPr>
-        <w:instrText>M</w:instrText>
-      </w:r>
-      <w:r>
-        <w:rPr>
-          <w:rFonts w:asciiTheme="minorHAnsi" w:hAnsiTheme="minorHAnsi" w:cstheme="minorHAnsi"/>
-          <w:i/>
-          <w:iCs/>
-        </w:rPr>
-        <w:fldChar w:fldCharType="end"/>
-      </w:r>
-      <w:r>
-        <w:rPr>
-          <w:rFonts w:asciiTheme="minorHAnsi" w:hAnsiTheme="minorHAnsi" w:cstheme="minorHAnsi"/>
-          <w:i/>
-          <w:iCs/>
-        </w:rPr>
-        <w:instrText xml:space="preserve"> = "F" "afiliada" "" </w:instrText>
-      </w:r>
-      <w:r>
-        <w:rPr>
-          <w:rFonts w:asciiTheme="minorHAnsi" w:hAnsiTheme="minorHAnsi" w:cstheme="minorHAnsi"/>
-          <w:i/>
-          <w:iCs/>
-        </w:rPr>
-        <w:fldChar w:fldCharType="end"/>
-      </w:r>
-      <w:r>
-        <w:rPr>
-          <w:rFonts w:asciiTheme="minorHAnsi" w:hAnsiTheme="minorHAnsi" w:cstheme="minorHAnsi"/>
-          <w:i/>
-          <w:iCs/>
-        </w:rPr>
-        <w:fldChar w:fldCharType="begin"/>
-      </w:r>
-      <w:r>
-        <w:rPr>
-          <w:rFonts w:asciiTheme="minorHAnsi" w:hAnsiTheme="minorHAnsi" w:cstheme="minorHAnsi"/>
-          <w:i/>
-          <w:iCs/>
-        </w:rPr>
-        <w:instrText xml:space="preserve"> IF </w:instrText>
-      </w:r>
-      <w:r>
-        <w:rPr>
-          <w:rFonts w:asciiTheme="minorHAnsi" w:hAnsiTheme="minorHAnsi" w:cstheme="minorHAnsi"/>
-          <w:i/>
-          <w:iCs/>
-        </w:rPr>
-        <w:fldChar w:fldCharType="begin"/>
-      </w:r>
-      <w:r>
-        <w:rPr>
-          <w:rFonts w:asciiTheme="minorHAnsi" w:hAnsiTheme="minorHAnsi" w:cstheme="minorHAnsi"/>
-          <w:i/>
-          <w:iCs/>
-        </w:rPr>
-        <w:instrText xml:space="preserve"> MERGEFIELD SEXO </w:instrText>
-      </w:r>
-      <w:r>
-        <w:rPr>
-          <w:rFonts w:asciiTheme="minorHAnsi" w:hAnsiTheme="minorHAnsi" w:cstheme="minorHAnsi"/>
-          <w:i/>
-          <w:iCs/>
-        </w:rPr>
-        <w:fldChar w:fldCharType="separate"/>
-      </w:r>
-      <w:r>
-        <w:rPr>
-          <w:rFonts w:asciiTheme="minorHAnsi" w:hAnsiTheme="minorHAnsi" w:cstheme="minorHAnsi"/>
-          <w:i/>
-          <w:iCs/>
-          <w:noProof/>
-        </w:rPr>
-        <w:instrText>M</w:instrText>
-      </w:r>
-      <w:r>
-        <w:rPr>
-          <w:rFonts w:asciiTheme="minorHAnsi" w:hAnsiTheme="minorHAnsi" w:cstheme="minorHAnsi"/>
-          <w:i/>
-          <w:iCs/>
-        </w:rPr>
-        <w:fldChar w:fldCharType="end"/>
-      </w:r>
-      <w:r>
-        <w:rPr>
-          <w:rFonts w:asciiTheme="minorHAnsi" w:hAnsiTheme="minorHAnsi" w:cstheme="minorHAnsi"/>
-          <w:i/>
-          <w:iCs/>
-        </w:rPr>
-        <w:instrText xml:space="preserve"> = "M" "afiliado" "" </w:instrText>
-      </w:r>
-      <w:r>
-        <w:rPr>
-          <w:rFonts w:asciiTheme="minorHAnsi" w:hAnsiTheme="minorHAnsi" w:cstheme="minorHAnsi"/>
-          <w:i/>
-          <w:iCs/>
-        </w:rPr>
-        <w:fldChar w:fldCharType="separate"/>
-      </w:r>
-      <w:r>
-        <w:rPr>
-          <w:rFonts w:asciiTheme="minorHAnsi" w:hAnsiTheme="minorHAnsi" w:cstheme="minorHAnsi"/>
-          <w:i/>
-          <w:iCs/>
-          <w:noProof/>
-        </w:rPr>
-        <w:t>afiliado</w:t>
-      </w:r>
-      <w:r>
-        <w:rPr>
-          <w:rFonts w:asciiTheme="minorHAnsi" w:hAnsiTheme="minorHAnsi" w:cstheme="minorHAnsi"/>
-          <w:i/>
-          <w:iCs/>
-        </w:rPr>
-        <w:fldChar w:fldCharType="end"/>
-      </w:r>
-      <w:r>
-        <w:rPr>
-          <w:rFonts w:asciiTheme="minorHAnsi" w:hAnsiTheme="minorHAnsi" w:cstheme="minorHAnsi"/>
-          <w:i/>
-          <w:iCs/>
-        </w:rPr>
-        <w:t xml:space="preserve"> </w:t>
-      </w:r>
-      <w:r>
-        <w:rPr>
-          <w:rFonts w:asciiTheme="minorHAnsi" w:hAnsiTheme="minorHAnsi" w:cstheme="minorHAnsi"/>
-          <w:i/>
-          <w:iCs/>
-        </w:rPr>
-        <w:t>al Sindicato</w:t>
-      </w:r>
-      <w:r>
-        <w:rPr>
-          <w:rFonts w:asciiTheme="minorHAnsi" w:hAnsiTheme="minorHAnsi" w:cstheme="minorHAnsi"/>
-          <w:i/>
-          <w:iCs/>
-        </w:rPr>
-        <w:fldChar w:fldCharType="begin"/>
-      </w:r>
-      <w:r>
-        <w:rPr>
-          <w:rFonts w:asciiTheme="minorHAnsi" w:hAnsiTheme="minorHAnsi" w:cstheme="minorHAnsi"/>
-          <w:i/>
-          <w:iCs/>
-        </w:rPr>
-        <w:instrText xml:space="preserve"> IF </w:instrText>
-      </w:r>
-      <w:r>
-        <w:rPr>
-          <w:rFonts w:asciiTheme="minorHAnsi" w:hAnsiTheme="minorHAnsi" w:cstheme="minorHAnsi"/>
-          <w:i/>
-          <w:iCs/>
-        </w:rPr>
-        <w:fldChar w:fldCharType="begin"/>
-      </w:r>
-      <w:r>
-        <w:rPr>
-          <w:rFonts w:asciiTheme="minorHAnsi" w:hAnsiTheme="minorHAnsi" w:cstheme="minorHAnsi"/>
-          <w:i/>
-          <w:iCs/>
-        </w:rPr>
-        <w:instrText xml:space="preserve"> MERGEFIELD INGRESO </w:instrText>
-      </w:r>
-      <w:r>
-        <w:rPr>
-          <w:rFonts w:asciiTheme="minorHAnsi" w:hAnsiTheme="minorHAnsi" w:cstheme="minorHAnsi"/>
-          <w:i/>
-          <w:iCs/>
-        </w:rPr>
-        <w:fldChar w:fldCharType="separate"/>
-      </w:r>
-      <w:r>
-        <w:rPr>
-          <w:rFonts w:asciiTheme="minorHAnsi" w:hAnsiTheme="minorHAnsi" w:cstheme="minorHAnsi"/>
-          <w:i/>
-          <w:iCs/>
-          <w:noProof/>
-        </w:rPr>
-        <w:instrText>abril 19/2024</w:instrText>
-      </w:r>
-      <w:r>
-        <w:rPr>
-          <w:rFonts w:asciiTheme="minorHAnsi" w:hAnsiTheme="minorHAnsi" w:cstheme="minorHAnsi"/>
-          <w:i/>
-          <w:iCs/>
-        </w:rPr>
-        <w:fldChar w:fldCharType="end"/>
-      </w:r>
-      <w:r>
-        <w:rPr>
-          <w:rFonts w:asciiTheme="minorHAnsi" w:hAnsiTheme="minorHAnsi" w:cstheme="minorHAnsi"/>
-          <w:i/>
-          <w:iCs/>
-        </w:rPr>
-        <w:instrText xml:space="preserve"> &lt;&gt; "" " desde " ""</w:instrText>
-      </w:r>
-      <w:r>
-        <w:rPr>
-          <w:rFonts w:asciiTheme="minorHAnsi" w:hAnsiTheme="minorHAnsi" w:cstheme="minorHAnsi"/>
-          <w:i/>
-          <w:iCs/>
-        </w:rPr>
-        <w:fldChar w:fldCharType="separate"/>
-      </w:r>
-      <w:r>
-        <w:rPr>
-          <w:rFonts w:asciiTheme="minorHAnsi" w:hAnsiTheme="minorHAnsi" w:cstheme="minorHAnsi"/>
-          <w:i/>
-          <w:iCs/>
-          <w:noProof/>
-        </w:rPr>
         <w:t xml:space="preserve"> desde </w:t>
       </w:r>
       <w:r>
@@ -1400,6 +878,14 @@
           <w:iCs/>
         </w:rPr>
         <w:fldChar w:fldCharType="end"/>
+      </w:r>
+      <w:r>
+        <w:rPr>
+          <w:rFonts w:asciiTheme="minorHAnsi" w:hAnsiTheme="minorHAnsi" w:cstheme="minorHAnsi"/>
+          <w:i/>
+          <w:iCs/>
+        </w:rPr>
+        <w:t xml:space="preserve">el </w:t>
       </w:r>
       <w:r>
         <w:rPr>
@@ -5090,82 +4576,16 @@
         <w:fldChar w:fldCharType="end"/>
       </w:r>
       <w:bookmarkEnd w:id="1"/>
-      <w:r>
-        <w:rPr>
-          <w:rFonts w:asciiTheme="minorHAnsi" w:hAnsiTheme="minorHAnsi" w:cstheme="minorHAnsi"/>
-          <w:i/>
-          <w:iCs/>
-        </w:rPr>
-        <w:fldChar w:fldCharType="begin"/>
-      </w:r>
-      <w:r>
-        <w:rPr>
-          <w:rFonts w:asciiTheme="minorHAnsi" w:hAnsiTheme="minorHAnsi" w:cstheme="minorHAnsi"/>
-          <w:i/>
-          <w:iCs/>
-        </w:rPr>
-        <w:instrText xml:space="preserve"> IF </w:instrText>
-      </w:r>
-      <w:r>
-        <w:rPr>
-          <w:rFonts w:asciiTheme="minorHAnsi" w:hAnsiTheme="minorHAnsi" w:cstheme="minorHAnsi"/>
-          <w:i/>
-          <w:iCs/>
-        </w:rPr>
-        <w:fldChar w:fldCharType="begin"/>
-      </w:r>
-      <w:r>
-        <w:rPr>
-          <w:rFonts w:asciiTheme="minorHAnsi" w:hAnsiTheme="minorHAnsi" w:cstheme="minorHAnsi"/>
-          <w:i/>
-          <w:iCs/>
-        </w:rPr>
-        <w:instrText xml:space="preserve"> MERGEFIELD SEXO </w:instrText>
-      </w:r>
-      <w:r>
-        <w:rPr>
-          <w:rFonts w:asciiTheme="minorHAnsi" w:hAnsiTheme="minorHAnsi" w:cstheme="minorHAnsi"/>
-          <w:i/>
-          <w:iCs/>
-        </w:rPr>
-        <w:fldChar w:fldCharType="separate"/>
-      </w:r>
-      <w:r>
-        <w:rPr>
-          <w:rFonts w:asciiTheme="minorHAnsi" w:hAnsiTheme="minorHAnsi" w:cstheme="minorHAnsi"/>
-          <w:i/>
-          <w:iCs/>
-          <w:noProof/>
-        </w:rPr>
-        <w:instrText>M</w:instrText>
-      </w:r>
-      <w:r>
-        <w:rPr>
-          <w:rFonts w:asciiTheme="minorHAnsi" w:hAnsiTheme="minorHAnsi" w:cstheme="minorHAnsi"/>
-          <w:i/>
-          <w:iCs/>
-        </w:rPr>
-        <w:fldChar w:fldCharType="end"/>
-      </w:r>
-      <w:r>
-        <w:rPr>
-          <w:rFonts w:asciiTheme="minorHAnsi" w:hAnsiTheme="minorHAnsi" w:cstheme="minorHAnsi"/>
-          <w:i/>
-          <w:iCs/>
-        </w:rPr>
-        <w:instrText xml:space="preserve"> = "M" "</w:instrText>
-      </w:r>
     </w:p>
     <w:p>
       <w:pPr>
         <w:spacing w:afterLines="120" w:after="288" w:line="240" w:lineRule="auto"/>
-        <w:ind w:left="708"/>
         <w:jc w:val="both"/>
         <w:rPr>
           <w:rFonts w:asciiTheme="minorHAnsi" w:hAnsiTheme="minorHAnsi" w:cstheme="minorHAnsi"/>
           <w:i/>
           <w:iCs/>
-          <w:noProof/>
+          <w:color w:val="000000" w:themeColor="text1"/>
         </w:rPr>
       </w:pPr>
       <w:r>
@@ -5174,45 +4594,26 @@
           <w:i/>
           <w:iCs/>
         </w:rPr>
-        <w:instrText xml:space="preserve">En calidad de afiliado partícipe" "" </w:instrText>
-      </w:r>
-      <w:r>
-        <w:rPr>
-          <w:rFonts w:asciiTheme="minorHAnsi" w:hAnsiTheme="minorHAnsi" w:cstheme="minorHAnsi"/>
-          <w:i/>
-          <w:iCs/>
-        </w:rPr>
-        <w:fldChar w:fldCharType="separate"/>
-      </w:r>
-    </w:p>
-    <w:p>
-      <w:pPr>
-        <w:spacing w:afterLines="120" w:after="288" w:line="240" w:lineRule="auto"/>
-        <w:ind w:left="709" w:hanging="1"/>
-        <w:jc w:val="both"/>
-        <w:rPr>
-          <w:rFonts w:asciiTheme="minorHAnsi" w:hAnsiTheme="minorHAnsi" w:cstheme="minorHAnsi"/>
-          <w:i/>
-          <w:iCs/>
-          <w:color w:val="000000" w:themeColor="text1"/>
-        </w:rPr>
-      </w:pPr>
-      <w:r>
-        <w:rPr>
-          <w:rFonts w:asciiTheme="minorHAnsi" w:hAnsiTheme="minorHAnsi" w:cstheme="minorHAnsi"/>
-          <w:i/>
-          <w:iCs/>
-          <w:noProof/>
-        </w:rPr>
-        <w:t>En calidad de afiliado partícipe</w:t>
-      </w:r>
-      <w:r>
-        <w:rPr>
-          <w:rFonts w:asciiTheme="minorHAnsi" w:hAnsiTheme="minorHAnsi" w:cstheme="minorHAnsi"/>
-          <w:i/>
-          <w:iCs/>
-        </w:rPr>
-        <w:fldChar w:fldCharType="end"/>
+        <w:t xml:space="preserve">En calidad de </w:t>
+      </w:r>
+      <w:r>
+        <w:rPr>
+          <w:rFonts w:asciiTheme="minorHAnsi" w:hAnsiTheme="minorHAnsi" w:cstheme="minorHAnsi"/>
+          <w:i/>
+          <w:iCs/>
+        </w:rPr>
+        <w:t>${</w:t>
+      </w:r>
+      <w:r>
+        <w:t>AFILIADO_AFILIADA</w:t>
+      </w:r>
+      <w:r>
+        <w:rPr>
+          <w:rFonts w:asciiTheme="minorHAnsi" w:hAnsiTheme="minorHAnsi" w:cstheme="minorHAnsi"/>
+          <w:i/>
+          <w:iCs/>
+        </w:rPr>
+        <w:t>}</w:t>
       </w:r>
       <w:r>
         <w:rPr>
@@ -5221,6 +4622,14 @@
           <w:iCs/>
         </w:rPr>
         <w:t xml:space="preserve"> </w:t>
+      </w:r>
+      <w:r>
+        <w:rPr>
+          <w:rFonts w:asciiTheme="minorHAnsi" w:hAnsiTheme="minorHAnsi" w:cstheme="minorHAnsi"/>
+          <w:i/>
+          <w:iCs/>
+        </w:rPr>
+        <w:t xml:space="preserve">partícipe </w:t>
       </w:r>
       <w:r>
         <w:rPr>
@@ -28216,7 +27625,7 @@
     <w:p>
       <w:pPr>
         <w:spacing w:after="0" w:line="240" w:lineRule="auto"/>
-        <w:ind w:left="709"/>
+        <w:jc w:val="both"/>
         <w:rPr>
           <w:rFonts w:asciiTheme="minorHAnsi" w:hAnsiTheme="minorHAnsi" w:cstheme="minorHAnsi"/>
         </w:rPr>
@@ -28447,7 +27856,7 @@
     <w:p>
       <w:pPr>
         <w:spacing w:after="0" w:line="240" w:lineRule="auto"/>
-        <w:ind w:left="709"/>
+        <w:jc w:val="both"/>
         <w:rPr>
           <w:rFonts w:asciiTheme="minorHAnsi" w:hAnsiTheme="minorHAnsi"/>
           <w:i/>
@@ -28554,7 +27963,7 @@
     <w:p>
       <w:pPr>
         <w:spacing w:after="0" w:line="240" w:lineRule="auto"/>
-        <w:ind w:left="709"/>
+        <w:jc w:val="both"/>
         <w:rPr>
           <w:rFonts w:asciiTheme="minorHAnsi" w:hAnsiTheme="minorHAnsi"/>
           <w:i/>
@@ -28571,10 +27980,10 @@
           <w:lang w:val="es-419" w:eastAsia="es-419"/>
         </w:rPr>
         <w:drawing>
-          <wp:anchor distT="0" distB="0" distL="114300" distR="114300" simplePos="0" relativeHeight="251659264" behindDoc="1" locked="0" layoutInCell="1" allowOverlap="1" wp14:anchorId="5D01061E" wp14:editId="3414D528">
+          <wp:anchor distT="0" distB="0" distL="114300" distR="114300" simplePos="0" relativeHeight="251659264" behindDoc="1" locked="0" layoutInCell="1" allowOverlap="1" wp14:anchorId="5D01061E" wp14:editId="2969CECA">
             <wp:simplePos x="0" y="0"/>
             <wp:positionH relativeFrom="column">
-              <wp:posOffset>957580</wp:posOffset>
+              <wp:posOffset>468630</wp:posOffset>
             </wp:positionH>
             <wp:positionV relativeFrom="paragraph">
               <wp:posOffset>10795</wp:posOffset>
@@ -28664,7 +28073,6 @@
     <w:p>
       <w:pPr>
         <w:pStyle w:val="Sinespaciado"/>
-        <w:ind w:left="709"/>
         <w:jc w:val="both"/>
         <w:rPr>
           <w:i/>
@@ -28679,6 +28087,25 @@
           <w:iCs/>
         </w:rPr>
         <w:t>JORGE IVAN ALVAREZ SOTO</w:t>
+      </w:r>
+    </w:p>
+    <w:p>
+      <w:pPr>
+        <w:pStyle w:val="Sinespaciado"/>
+        <w:jc w:val="both"/>
+        <w:rPr>
+          <w:b/>
+          <w:i/>
+          <w:iCs/>
+        </w:rPr>
+      </w:pPr>
+      <w:r>
+        <w:rPr>
+          <w:b/>
+          <w:i/>
+          <w:iCs/>
+        </w:rPr>
+        <w:t>Presidente</w:t>
       </w:r>
     </w:p>
     <w:p>
@@ -28692,62 +28119,19 @@
           <w:iCs/>
         </w:rPr>
       </w:pPr>
-      <w:r>
-        <w:rPr>
-          <w:b/>
-          <w:i/>
-          <w:iCs/>
-        </w:rPr>
-        <w:t>Presidente</w:t>
-      </w:r>
     </w:p>
     <w:p>
       <w:pPr>
-        <w:pStyle w:val="Sinespaciado"/>
-        <w:ind w:left="709"/>
-        <w:jc w:val="both"/>
-        <w:rPr>
+        <w:spacing w:after="0" w:line="240" w:lineRule="auto"/>
+        <w:ind w:left="708"/>
+        <w:jc w:val="right"/>
+        <w:rPr>
+          <w:rFonts w:asciiTheme="minorHAnsi" w:hAnsiTheme="minorHAnsi"/>
           <w:b/>
           <w:i/>
           <w:iCs/>
         </w:rPr>
       </w:pPr>
-    </w:p>
-    <w:p>
-      <w:pPr>
-        <w:pStyle w:val="Sinespaciado"/>
-        <w:ind w:left="709"/>
-        <w:jc w:val="both"/>
-        <w:rPr>
-          <w:i/>
-          <w:iCs/>
-          <w:color w:val="BFBFBF" w:themeColor="background1" w:themeShade="BF"/>
-          <w:sz w:val="18"/>
-          <w:szCs w:val="18"/>
-        </w:rPr>
-      </w:pPr>
-      <w:r>
-        <w:rPr>
-          <w:b/>
-          <w:i/>
-          <w:iCs/>
-          <w:color w:val="BFBFBF" w:themeColor="background1" w:themeShade="BF"/>
-          <w:sz w:val="18"/>
-          <w:szCs w:val="18"/>
-        </w:rPr>
-        <w:t>CC.</w:t>
-      </w:r>
-      <w:r>
-        <w:rPr>
-          <w:b/>
-          <w:i/>
-          <w:iCs/>
-          <w:color w:val="BFBFBF" w:themeColor="background1" w:themeShade="BF"/>
-          <w:sz w:val="18"/>
-          <w:szCs w:val="18"/>
-        </w:rPr>
-        <w:t xml:space="preserve"> ${CORREO_PERSONAL}</w:t>
-      </w:r>
     </w:p>
     <w:p>
       <w:pPr>

</xml_diff>

<commit_message>
refactor: delete message from automatic generation
</commit_message>
<xml_diff>
--- a/resources/templates/certificado_convenio_template.docx
+++ b/resources/templates/certificado_convenio_template.docx
@@ -29,7 +29,7 @@
           <w:noProof/>
           <w:lang w:val="es-419" w:eastAsia="es-419"/>
         </w:rPr>
-        <w:pict w14:anchorId="21823177">
+        <w:pict w14:anchorId="0D579711">
           <v:shapetype id="_x0000_t201" coordsize="21600,21600" o:spt="201" path="m,l,21600r21600,l21600,xe">
             <v:stroke joinstyle="miter"/>
             <v:path shadowok="f" o:extrusionok="f" strokeok="f" fillok="f" o:connecttype="rect"/>
@@ -27527,17 +27527,6 @@
           <w:szCs w:val="20"/>
         </w:rPr>
       </w:pPr>
-      <w:r>
-        <w:rPr>
-          <w:b/>
-          <w:i/>
-          <w:iCs/>
-          <w:color w:val="BFBFBF" w:themeColor="background1" w:themeShade="BF"/>
-          <w:sz w:val="20"/>
-          <w:szCs w:val="20"/>
-        </w:rPr>
-        <w:t>Generación automática</w:t>
-      </w:r>
     </w:p>
     <w:sectPr>
       <w:headerReference w:type="default" r:id="rId11"/>
@@ -27976,7 +27965,7 @@
         <v:path o:extrusionok="f" gradientshapeok="t" o:connecttype="rect"/>
         <o:lock v:ext="edit" aspectratio="t"/>
       </v:shapetype>
-      <v:shape id="Imagen 1302488667" o:spid="_x0000_i1025" type="#_x0000_t75" style="width:11.35pt;height:11.35pt;visibility:visible;mso-wrap-style:square" o:bullet="t">
+      <v:shape id="Imagen 1302488667" o:spid="_x0000_i1025" type="#_x0000_t75" style="width:11.15pt;height:11.15pt;visibility:visible;mso-wrap-style:square" o:bullet="t">
         <v:imagedata r:id="rId1" o:title=""/>
       </v:shape>
     </w:pict>

</xml_diff>

<commit_message>
fix: certificates with the item "other" should always remain pending
</commit_message>
<xml_diff>
--- a/resources/templates/certificado_convenio_template.docx
+++ b/resources/templates/certificado_convenio_template.docx
@@ -17,7 +17,7 @@
           <w:noProof/>
           <w:lang w:val="es-419" w:eastAsia="es-419"/>
         </w:rPr>
-        <w:pict w14:anchorId="55C49AD7">
+        <w:pict w14:anchorId="10755B91">
           <v:shapetype id="_x0000_t201" coordsize="21600,21600" o:spt="201" path="m,l,21600r21600,l21600,xe">
             <v:stroke joinstyle="miter"/>
             <v:path shadowok="f" o:extrusionok="f" strokeok="f" fillok="f" o:connecttype="rect"/>
@@ -352,17 +352,6 @@
     <w:p>
       <w:pPr>
         <w:spacing w:afterLines="120" w:after="288" w:line="240" w:lineRule="auto"/>
-        <w:jc w:val="center"/>
-        <w:rPr>
-          <w:rFonts w:asciiTheme="minorHAnsi" w:hAnsiTheme="minorHAnsi"/>
-          <w:i/>
-          <w:iCs/>
-        </w:rPr>
-      </w:pPr>
-    </w:p>
-    <w:p>
-      <w:pPr>
-        <w:spacing w:afterLines="120" w:after="288" w:line="240" w:lineRule="auto"/>
         <w:jc w:val="both"/>
         <w:rPr>
           <w:rFonts w:asciiTheme="minorHAnsi" w:hAnsiTheme="minorHAnsi" w:cstheme="minorHAnsi"/>
@@ -14642,17 +14631,6 @@
         </w:rPr>
         <w:t>Presidente</w:t>
       </w:r>
-    </w:p>
-    <w:p>
-      <w:pPr>
-        <w:pStyle w:val="Sinespaciado"/>
-        <w:jc w:val="both"/>
-        <w:rPr>
-          <w:b/>
-          <w:i/>
-          <w:iCs/>
-        </w:rPr>
-      </w:pPr>
     </w:p>
     <w:p>
       <w:pPr>
@@ -15212,7 +15190,7 @@
 <w:numbering xmlns:wpc="http://schemas.microsoft.com/office/word/2010/wordprocessingCanvas" xmlns:cx="http://schemas.microsoft.com/office/drawing/2014/chartex" xmlns:cx1="http://schemas.microsoft.com/office/drawing/2015/9/8/chartex" xmlns:cx2="http://schemas.microsoft.com/office/drawing/2015/10/21/chartex" xmlns:cx3="http://schemas.microsoft.com/office/drawing/2016/5/9/chartex" xmlns:cx4="http://schemas.microsoft.com/office/drawing/2016/5/10/chartex" xmlns:cx5="http://schemas.microsoft.com/office/drawing/2016/5/11/chartex" xmlns:cx6="http://schemas.microsoft.com/office/drawing/2016/5/12/chartex" xmlns:cx7="http://schemas.microsoft.com/office/drawing/2016/5/13/chartex" xmlns:cx8="http://schemas.microsoft.com/office/drawing/2016/5/14/chartex" xmlns:mc="http://schemas.openxmlformats.org/markup-compatibility/2006" xmlns:aink="http://schemas.microsoft.com/office/drawing/2016/ink" xmlns:am3d="http://schemas.microsoft.com/office/drawing/2017/model3d" xmlns:o="urn:schemas-microsoft-com:office:office" xmlns:oel="http://schemas.microsoft.com/office/2019/extlst" xmlns:r="http://schemas.openxmlformats.org/officeDocument/2006/relationships" xmlns:m="http://schemas.openxmlformats.org/officeDocument/2006/math" xmlns:v="urn:schemas-microsoft-com:vml" xmlns:wp14="http://schemas.microsoft.com/office/word/2010/wordprocessingDrawing" xmlns:wp="http://schemas.openxmlformats.org/drawingml/2006/wordprocessingDrawing" xmlns:w10="urn:schemas-microsoft-com:office:word" xmlns:w="http://schemas.openxmlformats.org/wordprocessingml/2006/main" xmlns:w14="http://schemas.microsoft.com/office/word/2010/wordml" xmlns:w15="http://schemas.microsoft.com/office/word/2012/wordml" xmlns:w16cex="http://schemas.microsoft.com/office/word/2018/wordml/cex" xmlns:w16cid="http://schemas.microsoft.com/office/word/2016/wordml/cid" xmlns:w16="http://schemas.microsoft.com/office/word/2018/wordml" xmlns:w16du="http://schemas.microsoft.com/office/word/2023/wordml/word16du" xmlns:w16sdtdh="http://schemas.microsoft.com/office/word/2020/wordml/sdtdatahash" xmlns:w16sdtfl="http://schemas.microsoft.com/office/word/2024/wordml/sdtformatlock" xmlns:w16se="http://schemas.microsoft.com/office/word/2015/wordml/symex" xmlns:wpg="http://schemas.microsoft.com/office/word/2010/wordprocessingGroup" xmlns:wpi="http://schemas.microsoft.com/office/word/2010/wordprocessingInk" xmlns:wne="http://schemas.microsoft.com/office/word/2006/wordml" xmlns:wps="http://schemas.microsoft.com/office/word/2010/wordprocessingShape" mc:Ignorable="w14 w15 w16se w16cid w16 w16cex w16sdtdh w16sdtfl w16du wp14">
   <w:numPicBullet w:numPicBulletId="0">
     <w:pict>
-      <v:shapetype w14:anchorId="55C49AD7" id="_x0000_t75" coordsize="21600,21600" o:spt="75" o:preferrelative="t" path="m@4@5l@4@11@9@11@9@5xe" filled="f" stroked="f">
+      <v:shapetype w14:anchorId="10755B91" id="_x0000_t75" coordsize="21600,21600" o:spt="75" o:preferrelative="t" path="m@4@5l@4@11@9@11@9@5xe" filled="f" stroked="f">
         <v:stroke joinstyle="miter"/>
         <v:formulas>
           <v:f eqn="if lineDrawn pixelLineWidth 0"/>

</xml_diff>